<commit_message>
Update progress report Section 2 with current 1,721-market panel numbers
Section 2's market panel table was stale at 845 markets (517 tomato / 246
onion / 82 potato) from an earlier pipeline stage. Verified the current
figures directly against Model_Output/filtered_panel_top.csv: 1,721 markets
total (832 tomato / 807 onion / 82 potato), 514,014 market-weeks, 89.6%
real (non-imputed).

Also fixed the same stale 845/517/246/422,254 figures everywhere else they
appeared in the document (opening summary, dashboard description, methods
section reference, project-statistics table, imputation breakdown) for
internal consistency, plus a leftover "80 commits" repo-line count that
predated the 5 August stats-table update.

Co-Authored-By: Claude Sonnet 5 <noreply@anthropic.com>
</commit_message>
<xml_diff>
--- a/reports/TOP_Digital_Twin_Progress_Report_2026-08-05.docx
+++ b/reports/TOP_Digital_Twin_Progress_Report_2026-08-05.docx
@@ -143,7 +143,7 @@
           <w:sz w:val="22"/>
           <w:szCs w:val="22"/>
         </w:rPr>
-        <w:t xml:space="preserve">github.com/masroor01/TOP-Digital-Twin  (public, 80 commits) — with a live, interactive scenario-simulation dashboard</w:t>
+        <w:t xml:space="preserve">github.com/masroor01/TOP-Digital-Twin  (public, 97 commits) — with a live, interactive scenario-simulation dashboard</w:t>
       </w:r>
     </w:p>
     <w:tbl>
@@ -199,7 +199,7 @@
                 <w:sz w:val="22"/>
                 <w:szCs w:val="22"/>
               </w:rPr>
-              <w:t xml:space="preserve">This report covers the full arc of the TOP Digital Twin project to date: a six-layer, 845-market, ~500-week weekly price panel for tomato, onion, and potato; a validated LightGBM forecasting pipeline (M0–M6) benchmarked against tree ensembles and deep learning; rigorous statistical validation (Diebold-Mariano tests and a Model Confidence Set); real-world crisis backtests against the 2023–24 tomato and onion price shocks; a formal Granger-causality analysis of what actually drives price; a stress-testing module that surfaced a genuine, reportable limitation; and a deployed, public interactive dashboard. Two sections of the manuscript are drafted and verified against the current pipeline. The only outstanding items are the (deliberately deferred) full-capacity Temporal Fusion Transformer run and finishing the manuscript.</w:t>
+              <w:t xml:space="preserve">This report covers the full arc of the TOP Digital Twin project to date: a six-layer, 1,721-market, ~500-week weekly price panel for tomato, onion, and potato; a validated LightGBM forecasting pipeline (M0–M6) benchmarked against tree ensembles and deep learning; rigorous statistical validation (Diebold-Mariano tests and a Model Confidence Set); real-world crisis backtests against the 2023–24 tomato and onion price shocks; a formal Granger-causality analysis of what actually drives price; a stress-testing module that surfaced a genuine, reportable limitation; and a deployed, public interactive dashboard. Two sections of the manuscript are drafted and verified against the current pipeline. The only outstanding items are the (deliberately deferred) full-capacity Temporal Fusion Transformer run and finishing the manuscript.</w:t>
             </w:r>
           </w:p>
         </w:tc>
@@ -1236,7 +1236,7 @@
                 <w:sz w:val="19"/>
                 <w:szCs w:val="19"/>
               </w:rPr>
-              <w:t xml:space="preserve">517</w:t>
+              <w:t xml:space="preserve">832</w:t>
             </w:r>
           </w:p>
         </w:tc>
@@ -1262,7 +1262,7 @@
                 <w:sz w:val="19"/>
                 <w:szCs w:val="19"/>
               </w:rPr>
-              <w:t xml:space="preserve">20</w:t>
+              <w:t xml:space="preserve">22</w:t>
             </w:r>
           </w:p>
         </w:tc>
@@ -1288,7 +1288,7 @@
                 <w:sz w:val="19"/>
                 <w:szCs w:val="19"/>
               </w:rPr>
-              <w:t xml:space="preserve">258,500</w:t>
+              <w:t xml:space="preserve">300,344</w:t>
             </w:r>
           </w:p>
         </w:tc>
@@ -1314,7 +1314,7 @@
                 <w:sz w:val="19"/>
                 <w:szCs w:val="19"/>
               </w:rPr>
-              <w:t xml:space="preserve">90.2%</w:t>
+              <w:t xml:space="preserve">92.4%</w:t>
             </w:r>
           </w:p>
         </w:tc>
@@ -1394,7 +1394,7 @@
                 <w:sz w:val="19"/>
                 <w:szCs w:val="19"/>
               </w:rPr>
-              <w:t xml:space="preserve">246</w:t>
+              <w:t xml:space="preserve">807</w:t>
             </w:r>
           </w:p>
         </w:tc>
@@ -1420,7 +1420,7 @@
                 <w:sz w:val="19"/>
                 <w:szCs w:val="19"/>
               </w:rPr>
-              <w:t xml:space="preserve">15</w:t>
+              <w:t xml:space="preserve">25</w:t>
             </w:r>
           </w:p>
         </w:tc>
@@ -1446,7 +1446,7 @@
                 <w:sz w:val="19"/>
                 <w:szCs w:val="19"/>
               </w:rPr>
-              <w:t xml:space="preserve">122,754</w:t>
+              <w:t xml:space="preserve">172,682</w:t>
             </w:r>
           </w:p>
         </w:tc>
@@ -1472,7 +1472,7 @@
                 <w:sz w:val="19"/>
                 <w:szCs w:val="19"/>
               </w:rPr>
-              <w:t xml:space="preserve">90.0%</w:t>
+              <w:t xml:space="preserve">95.6%</w:t>
             </w:r>
           </w:p>
         </w:tc>
@@ -1498,7 +1498,7 @@
                 <w:sz w:val="19"/>
                 <w:szCs w:val="19"/>
               </w:rPr>
-              <w:t xml:space="preserve">70.5%</w:t>
+              <w:t xml:space="preserve">70.4%</w:t>
             </w:r>
           </w:p>
         </w:tc>
@@ -1604,7 +1604,7 @@
                 <w:sz w:val="19"/>
                 <w:szCs w:val="19"/>
               </w:rPr>
-              <w:t xml:space="preserve">41,000</w:t>
+              <w:t xml:space="preserve">40,988</w:t>
             </w:r>
           </w:p>
         </w:tc>
@@ -1687,27 +1687,27 @@
           <w:sz w:val="22"/>
           <w:szCs w:val="22"/>
         </w:rPr>
-        <w:t xml:space="preserve">Of 422,254 total market-week rows, </w:t>
-      </w:r>
-      <w:r>
-        <w:rPr>
-          <w:rFonts w:ascii="Calibri" w:cs="Calibri" w:eastAsia="Calibri" w:hAnsi="Calibri"/>
-          <w:b/>
-          <w:bCs/>
-          <w:color w:val="1A2518"/>
-          <w:sz w:val="22"/>
-          <w:szCs w:val="22"/>
-        </w:rPr>
-        <w:t xml:space="preserve">88.7% are real trade observations</w:t>
-      </w:r>
-      <w:r>
-        <w:rPr>
-          <w:rFonts w:ascii="Calibri" w:cs="Calibri" w:eastAsia="Calibri" w:hAnsi="Calibri"/>
-          <w:color w:val="1A2518"/>
-          <w:sz w:val="22"/>
-          <w:szCs w:val="22"/>
-        </w:rPr>
-        <w:t xml:space="preserve">; the remainder are transparently flagged and imputed (4.1% linear, 1.5% seasonal-median, 5.7% left unfilled where a gap exceeded the imputation policy's tolerance) — every row is labelled real vs. imputed, so downstream analysis can distinguish the two.</w:t>
+        <w:t xml:space="preserve">Of 514,014 total market-week rows, </w:t>
+      </w:r>
+      <w:r>
+        <w:rPr>
+          <w:rFonts w:ascii="Calibri" w:cs="Calibri" w:eastAsia="Calibri" w:hAnsi="Calibri"/>
+          <w:b/>
+          <w:bCs/>
+          <w:color w:val="1A2518"/>
+          <w:sz w:val="22"/>
+          <w:szCs w:val="22"/>
+        </w:rPr>
+        <w:t xml:space="preserve">89.6% are real trade observations</w:t>
+      </w:r>
+      <w:r>
+        <w:rPr>
+          <w:rFonts w:ascii="Calibri" w:cs="Calibri" w:eastAsia="Calibri" w:hAnsi="Calibri"/>
+          <w:color w:val="1A2518"/>
+          <w:sz w:val="22"/>
+          <w:szCs w:val="22"/>
+        </w:rPr>
+        <w:t xml:space="preserve">; the remainder are transparently flagged and imputed (4.0% linear, 1.5% seasonal-median, 4.9% left unfilled where a gap exceeded the imputation policy's tolerance) — every row is labelled real vs. imputed, so downstream analysis can distinguish the two.</w:t>
       </w:r>
     </w:p>
     <w:tbl>
@@ -4490,7 +4490,7 @@
           <w:sz w:val="22"/>
           <w:szCs w:val="22"/>
         </w:rPr>
-        <w:t xml:space="preserve">Crop / State / Market selection across all 845 filtered markets, with a live coverage and data-recency disclosure panel.</w:t>
+        <w:t xml:space="preserve">Crop / State / Market selection across all 1,721 filtered markets, with a live coverage and data-recency disclosure panel.</w:t>
       </w:r>
     </w:p>
     <w:p>
@@ -4728,7 +4728,7 @@
           <w:sz w:val="22"/>
           <w:szCs w:val="22"/>
         </w:rPr>
-        <w:t xml:space="preserve"> — fully rewritten this session to match the current 70%-coverage, 845-market, six-layer pipeline (an earlier draft had drifted to describe a 90%-threshold, 4-layer, 286/123/64-market panel from months ago, including one factual error about imputation that has now been corrected).</w:t>
+        <w:t xml:space="preserve"> — fully rewritten this session to match the current 70%-coverage, 1,721-market, six-layer pipeline (an earlier draft had drifted to describe a 90%-threshold, 4-layer, 286/123/64-market panel from months ago, including one factual error about imputation that has now been corrected).</w:t>
       </w:r>
     </w:p>
     <w:p>
@@ -5009,7 +5009,7 @@
                 <w:sz w:val="19"/>
                 <w:szCs w:val="19"/>
               </w:rPr>
-              <w:t xml:space="preserve">845 (517 tomato + 246 onion + 82 potato)</w:t>
+              <w:t xml:space="preserve">1,721 (832 tomato + 807 onion + 82 potato)</w:t>
             </w:r>
           </w:p>
         </w:tc>
@@ -5063,7 +5063,7 @@
                 <w:sz w:val="19"/>
                 <w:szCs w:val="19"/>
               </w:rPr>
-              <w:t xml:space="preserve">422,254</w:t>
+              <w:t xml:space="preserve">514,014</w:t>
             </w:r>
           </w:p>
         </w:tc>

</xml_diff>